<commit_message>
Add Goose integration docs, thumbnail, and trim demo script
- Add "Why Direct Mode in Production?" section to README
- Add "Try Goose Mode Locally" instructions for judges
- Add detailed Goose architecture explanation to DECISION_LOG
- Trim demo video script from 5min to ~4min
- Add project thumbnail for Devpost submission
- Update all .docx files from latest markdown sources
</commit_message>
<xml_diff>
--- a/docs/AI_TRACE_LOG.docx
+++ b/docs/AI_TRACE_LOG.docx
@@ -10,29 +10,47 @@
         <w:t>EqualTales — AI Trace Log</w:t>
       </w:r>
     </w:p>
-    <w:p/>
     <w:p>
       <w:r>
-        <w:t>Project: EqualTales</w:t>
+        <w:rPr>
+          <w:b/>
+        </w:rPr>
+        <w:t>Project:</w:t>
+      </w:r>
+      <w:r>
+        <w:t xml:space="preserve"> EqualTales</w:t>
       </w:r>
     </w:p>
     <w:p>
       <w:r>
-        <w:t>Team: Solo Builder</w:t>
+        <w:rPr>
+          <w:b/>
+        </w:rPr>
+        <w:t>Team:</w:t>
+      </w:r>
+      <w:r>
+        <w:t xml:space="preserve"> Solo Builder</w:t>
       </w:r>
     </w:p>
     <w:p>
       <w:r>
-        <w:t>Principle: Augment, Not Abdicate</w:t>
+        <w:rPr>
+          <w:b/>
+        </w:rPr>
+        <w:t>Principle:</w:t>
+      </w:r>
+      <w:r>
+        <w:t xml:space="preserve"> Augment, Not Abdicate — Every AI output reviewed and verified by a human before use.</w:t>
       </w:r>
     </w:p>
-    <w:p/>
     <w:p>
       <w:r>
-        <w:t>──────────────────────────────────────────────────</w:t>
+        <w:rPr>
+          <w:color w:val="C8C8C8"/>
+        </w:rPr>
+        <w:t>────────────────────────────────────────────────────────────</w:t>
       </w:r>
     </w:p>
-    <w:p/>
     <w:p>
       <w:pPr>
         <w:pStyle w:val="Heading2"/>
@@ -41,20 +59,19 @@
         <w:t>AI Usage Traces</w:t>
       </w:r>
     </w:p>
-    <w:p/>
     <w:p>
       <w:pPr>
         <w:pStyle w:val="Heading3"/>
       </w:pPr>
       <w:r>
-        <w:t>Trace 1: Story Generation</w:t>
+        <w:t>Trace 1: Story Generation (Core Product)</w:t>
       </w:r>
     </w:p>
-    <w:p/>
     <w:tbl>
       <w:tblPr>
         <w:tblStyle w:val="TableGrid"/>
         <w:tblW w:type="auto" w:w="0"/>
+        <w:jc w:val="center"/>
         <w:tblLook w:firstColumn="1" w:firstRow="1" w:lastColumn="0" w:lastRow="0" w:noHBand="0" w:noVBand="1" w:val="04A0"/>
       </w:tblPr>
       <w:tblGrid>
@@ -67,7 +84,12 @@
             <w:tcW w:type="dxa" w:w="4320"/>
           </w:tcPr>
           <w:p>
+            <w:r/>
             <w:r>
+              <w:rPr>
+                <w:b/>
+                <w:sz w:val="20"/>
+              </w:rPr>
               <w:t>Field</w:t>
             </w:r>
           </w:p>
@@ -77,7 +99,12 @@
             <w:tcW w:type="dxa" w:w="4320"/>
           </w:tcPr>
           <w:p>
+            <w:r/>
             <w:r>
+              <w:rPr>
+                <w:b/>
+                <w:sz w:val="20"/>
+              </w:rPr>
               <w:t>Content</w:t>
             </w:r>
           </w:p>
@@ -89,8 +116,12 @@
             <w:tcW w:type="dxa" w:w="4320"/>
           </w:tcPr>
           <w:p>
+            <w:r/>
             <w:r>
-              <w:t>**Category**</w:t>
+              <w:rPr>
+                <w:sz w:val="20"/>
+              </w:rPr>
+              <w:t>Category</w:t>
             </w:r>
           </w:p>
         </w:tc>
@@ -99,7 +130,11 @@
             <w:tcW w:type="dxa" w:w="4320"/>
           </w:tcPr>
           <w:p>
+            <w:r/>
             <w:r>
+              <w:rPr>
+                <w:sz w:val="20"/>
+              </w:rPr>
               <w:t>Content Generation</w:t>
             </w:r>
           </w:p>
@@ -111,8 +146,12 @@
             <w:tcW w:type="dxa" w:w="4320"/>
           </w:tcPr>
           <w:p>
+            <w:r/>
             <w:r>
-              <w:t>**Tool**</w:t>
+              <w:rPr>
+                <w:sz w:val="20"/>
+              </w:rPr>
+              <w:t>Tool</w:t>
             </w:r>
           </w:p>
         </w:tc>
@@ -121,7 +160,11 @@
             <w:tcW w:type="dxa" w:w="4320"/>
           </w:tcPr>
           <w:p>
+            <w:r/>
             <w:r>
+              <w:rPr>
+                <w:sz w:val="20"/>
+              </w:rPr>
               <w:t>Claude Opus 4.6 via OpenRouter</w:t>
             </w:r>
           </w:p>
@@ -133,8 +176,12 @@
             <w:tcW w:type="dxa" w:w="4320"/>
           </w:tcPr>
           <w:p>
+            <w:r/>
             <w:r>
-              <w:t>**Prompt**</w:t>
+              <w:rPr>
+                <w:sz w:val="20"/>
+              </w:rPr>
+              <w:t>MCP Tool</w:t>
             </w:r>
           </w:p>
         </w:tc>
@@ -143,8 +190,12 @@
             <w:tcW w:type="dxa" w:w="4320"/>
           </w:tcPr>
           <w:p>
+            <w:r/>
             <w:r>
-              <w:t>"You are a children's story writer creating an anti-stereotype story. Write a 5-page illustrated children's story. [Includes: stereotype to counter, child's name/age, real woman to feature, narrative arc structure, writing rules for age group, JSON output format]"</w:t>
+              <w:rPr>
+                <w:sz w:val="20"/>
+              </w:rPr>
+              <w:t>generate_story in mcp_server/server.py</w:t>
             </w:r>
           </w:p>
         </w:tc>
@@ -155,8 +206,12 @@
             <w:tcW w:type="dxa" w:w="4320"/>
           </w:tcPr>
           <w:p>
+            <w:r/>
             <w:r>
-              <w:t>**AI Response**</w:t>
+              <w:rPr>
+                <w:sz w:val="20"/>
+              </w:rPr>
+              <w:t>Input</w:t>
             </w:r>
           </w:p>
         </w:tc>
@@ -165,8 +220,12 @@
             <w:tcW w:type="dxa" w:w="4320"/>
           </w:tcPr>
           <w:p>
+            <w:r/>
             <w:r>
-              <w:t>Complete 5-page story with title, page texts, illustration descriptions, discussion prompts, and activity suggestion in structured JSON</w:t>
+              <w:rPr>
+                <w:sz w:val="20"/>
+              </w:rPr>
+              <w:t>Stereotype text, child name/age, matched woman's profile (name, achievement, fairy_tale_moment, age_adaptation), counter_message</w:t>
             </w:r>
           </w:p>
         </w:tc>
@@ -177,8 +236,12 @@
             <w:tcW w:type="dxa" w:w="4320"/>
           </w:tcPr>
           <w:p>
+            <w:r/>
             <w:r>
-              <w:t>**What I Kept**</w:t>
+              <w:rPr>
+                <w:sz w:val="20"/>
+              </w:rPr>
+              <w:t>Prompt Design</w:t>
             </w:r>
           </w:p>
         </w:tc>
@@ -187,8 +250,12 @@
             <w:tcW w:type="dxa" w:w="4320"/>
           </w:tcPr>
           <w:p>
+            <w:r/>
             <w:r>
-              <w:t>Narrative structure, age-appropriate vocabulary, emotional arc from belief to new understanding</w:t>
+              <w:rPr>
+                <w:sz w:val="20"/>
+              </w:rPr>
+              <w:t>Structured 5-page narrative arc (Belief → Question → Discovery → Inspiration → New Belief) with age-specific writing rules (young: 5-10 word sentences, middle: vivid descriptions, older: rich vocabulary). Explicit instruction: "Show, don't tell. Never say 'stereotypes are bad.'"</w:t>
             </w:r>
           </w:p>
         </w:tc>
@@ -199,8 +266,12 @@
             <w:tcW w:type="dxa" w:w="4320"/>
           </w:tcPr>
           <w:p>
+            <w:r/>
             <w:r>
-              <w:t>**What I Changed**</w:t>
+              <w:rPr>
+                <w:sz w:val="20"/>
+              </w:rPr>
+              <w:t>AI Output</w:t>
             </w:r>
           </w:p>
         </w:tc>
@@ -209,8 +280,12 @@
             <w:tcW w:type="dxa" w:w="4320"/>
           </w:tcPr>
           <w:p>
+            <w:r/>
             <w:r>
-              <w:t>Added explicit instruction NOT to describe child's race/ethnicity in illustration descriptions (handled separately by character diversity system); enforced JSON output format for reliable parsing</w:t>
+              <w:rPr>
+                <w:sz w:val="20"/>
+              </w:rPr>
+              <w:t>Complete 5-page story in JSON: title, page texts, illustration descriptions, discussion prompts, activity suggestion</w:t>
             </w:r>
           </w:p>
         </w:tc>
@@ -221,8 +296,12 @@
             <w:tcW w:type="dxa" w:w="4320"/>
           </w:tcPr>
           <w:p>
+            <w:r/>
             <w:r>
-              <w:t>**Verification**</w:t>
+              <w:rPr>
+                <w:sz w:val="20"/>
+              </w:rPr>
+              <w:t>What I Kept</w:t>
             </w:r>
           </w:p>
         </w:tc>
@@ -231,8 +310,72 @@
             <w:tcW w:type="dxa" w:w="4320"/>
           </w:tcPr>
           <w:p>
+            <w:r/>
             <w:r>
-              <w:t>Manual reading of 10+ generated stories for quality; automated QA verification loop for stereotype reinforcement; checked that discussion prompts are open-ended questions</w:t>
+              <w:rPr>
+                <w:sz w:val="20"/>
+              </w:rPr>
+              <w:t>Narrative structure, age-appropriate vocabulary, emotional arc</w:t>
+            </w:r>
+          </w:p>
+        </w:tc>
+      </w:tr>
+      <w:tr>
+        <w:tc>
+          <w:tcPr>
+            <w:tcW w:type="dxa" w:w="4320"/>
+          </w:tcPr>
+          <w:p>
+            <w:r/>
+            <w:r>
+              <w:rPr>
+                <w:sz w:val="20"/>
+              </w:rPr>
+              <w:t>What I Changed</w:t>
+            </w:r>
+          </w:p>
+        </w:tc>
+        <w:tc>
+          <w:tcPr>
+            <w:tcW w:type="dxa" w:w="4320"/>
+          </w:tcPr>
+          <w:p>
+            <w:r/>
+            <w:r>
+              <w:rPr>
+                <w:sz w:val="20"/>
+              </w:rPr>
+              <w:t>Added "Do NOT describe the child's race, skin color, hair type, or ethnicity" in illustration descriptions (handled by separate character diversity system); enforced strict JSON output; "Discovery, Not Biography" design principle</w:t>
+            </w:r>
+          </w:p>
+        </w:tc>
+      </w:tr>
+      <w:tr>
+        <w:tc>
+          <w:tcPr>
+            <w:tcW w:type="dxa" w:w="4320"/>
+          </w:tcPr>
+          <w:p>
+            <w:r/>
+            <w:r>
+              <w:rPr>
+                <w:sz w:val="20"/>
+              </w:rPr>
+              <w:t>Verification</w:t>
+            </w:r>
+          </w:p>
+        </w:tc>
+        <w:tc>
+          <w:tcPr>
+            <w:tcW w:type="dxa" w:w="4320"/>
+          </w:tcPr>
+          <w:p>
+            <w:r/>
+            <w:r>
+              <w:rPr>
+                <w:sz w:val="20"/>
+              </w:rPr>
+              <w:t>Manual reading of 10+ generated stories; automated QA verification loop (Tool 4); checked discussion prompts are open-ended; verified age-appropriate vocabulary per tier</w:t>
             </w:r>
           </w:p>
         </w:tc>
@@ -241,10 +384,12 @@
     <w:p/>
     <w:p>
       <w:r>
-        <w:t>──────────────────────────────────────────────────</w:t>
+        <w:rPr>
+          <w:color w:val="C8C8C8"/>
+        </w:rPr>
+        <w:t>────────────────────────────────────────────────────────────</w:t>
       </w:r>
     </w:p>
-    <w:p/>
     <w:p>
       <w:pPr>
         <w:pStyle w:val="Heading3"/>
@@ -253,11 +398,11 @@
         <w:t>Trace 2: Stereotype Classification</w:t>
       </w:r>
     </w:p>
-    <w:p/>
     <w:tbl>
       <w:tblPr>
         <w:tblStyle w:val="TableGrid"/>
         <w:tblW w:type="auto" w:w="0"/>
+        <w:jc w:val="center"/>
         <w:tblLook w:firstColumn="1" w:firstRow="1" w:lastColumn="0" w:lastRow="0" w:noHBand="0" w:noVBand="1" w:val="04A0"/>
       </w:tblPr>
       <w:tblGrid>
@@ -270,7 +415,12 @@
             <w:tcW w:type="dxa" w:w="4320"/>
           </w:tcPr>
           <w:p>
+            <w:r/>
             <w:r>
+              <w:rPr>
+                <w:b/>
+                <w:sz w:val="20"/>
+              </w:rPr>
               <w:t>Field</w:t>
             </w:r>
           </w:p>
@@ -280,7 +430,12 @@
             <w:tcW w:type="dxa" w:w="4320"/>
           </w:tcPr>
           <w:p>
+            <w:r/>
             <w:r>
+              <w:rPr>
+                <w:b/>
+                <w:sz w:val="20"/>
+              </w:rPr>
               <w:t>Content</w:t>
             </w:r>
           </w:p>
@@ -292,8 +447,12 @@
             <w:tcW w:type="dxa" w:w="4320"/>
           </w:tcPr>
           <w:p>
+            <w:r/>
             <w:r>
-              <w:t>**Category**</w:t>
+              <w:rPr>
+                <w:sz w:val="20"/>
+              </w:rPr>
+              <w:t>Category</w:t>
             </w:r>
           </w:p>
         </w:tc>
@@ -302,7 +461,11 @@
             <w:tcW w:type="dxa" w:w="4320"/>
           </w:tcPr>
           <w:p>
+            <w:r/>
             <w:r>
+              <w:rPr>
+                <w:sz w:val="20"/>
+              </w:rPr>
               <w:t>Analysis / Classification</w:t>
             </w:r>
           </w:p>
@@ -314,8 +477,12 @@
             <w:tcW w:type="dxa" w:w="4320"/>
           </w:tcPr>
           <w:p>
+            <w:r/>
             <w:r>
-              <w:t>**Tool**</w:t>
+              <w:rPr>
+                <w:sz w:val="20"/>
+              </w:rPr>
+              <w:t>Tool</w:t>
             </w:r>
           </w:p>
         </w:tc>
@@ -324,7 +491,11 @@
             <w:tcW w:type="dxa" w:w="4320"/>
           </w:tcPr>
           <w:p>
+            <w:r/>
             <w:r>
+              <w:rPr>
+                <w:sz w:val="20"/>
+              </w:rPr>
               <w:t>Claude Sonnet 4.5 via OpenRouter</w:t>
             </w:r>
           </w:p>
@@ -336,8 +507,12 @@
             <w:tcW w:type="dxa" w:w="4320"/>
           </w:tcPr>
           <w:p>
+            <w:r/>
             <w:r>
-              <w:t>**Prompt**</w:t>
+              <w:rPr>
+                <w:sz w:val="20"/>
+              </w:rPr>
+              <w:t>MCP Tool</w:t>
             </w:r>
           </w:p>
         </w:tc>
@@ -346,8 +521,12 @@
             <w:tcW w:type="dxa" w:w="4320"/>
           </w:tcPr>
           <w:p>
+            <w:r/>
             <w:r>
-              <w:t>"Analyze this stereotype that a child has expressed or a parent wants to counter: [stereotype_text]. Available categories: [14 categories]. Return JSON with primary_category, secondary_categories, stereotype_essence, age_strategy, emotional_tone."</w:t>
+              <w:rPr>
+                <w:sz w:val="20"/>
+              </w:rPr>
+              <w:t>classify_stereotype in mcp_server/server.py</w:t>
             </w:r>
           </w:p>
         </w:tc>
@@ -358,8 +537,12 @@
             <w:tcW w:type="dxa" w:w="4320"/>
           </w:tcPr>
           <w:p>
+            <w:r/>
             <w:r>
-              <w:t>**AI Response**</w:t>
+              <w:rPr>
+                <w:sz w:val="20"/>
+              </w:rPr>
+              <w:t>Input</w:t>
             </w:r>
           </w:p>
         </w:tc>
@@ -368,8 +551,12 @@
             <w:tcW w:type="dxa" w:w="4320"/>
           </w:tcPr>
           <w:p>
+            <w:r/>
             <w:r>
-              <w:t>JSON classification with category mapping and age-appropriate counter-narrative strategy</w:t>
+              <w:rPr>
+                <w:sz w:val="20"/>
+              </w:rPr>
+              <w:t>Free-text stereotype (e.g., "My daughter thinks only boys can be scientists") + list of 14 valid categories</w:t>
             </w:r>
           </w:p>
         </w:tc>
@@ -380,8 +567,12 @@
             <w:tcW w:type="dxa" w:w="4320"/>
           </w:tcPr>
           <w:p>
+            <w:r/>
             <w:r>
-              <w:t>**What I Kept**</w:t>
+              <w:rPr>
+                <w:sz w:val="20"/>
+              </w:rPr>
+              <w:t>Prompt Design</w:t>
             </w:r>
           </w:p>
         </w:tc>
@@ -390,8 +581,12 @@
             <w:tcW w:type="dxa" w:w="4320"/>
           </w:tcPr>
           <w:p>
+            <w:r/>
             <w:r>
-              <w:t>Category detection logic, emotional tone analysis, age-group-specific strategies</w:t>
+              <w:rPr>
+                <w:sz w:val="20"/>
+              </w:rPr>
+              <w:t>Simplified to return only primary_category + secondary_categories (0-2). Max tokens reduced to 256. Removed unused fields (stereotype_essence, age_strategy, emotional_tone) to cut latency and cost.</w:t>
             </w:r>
           </w:p>
         </w:tc>
@@ -402,8 +597,12 @@
             <w:tcW w:type="dxa" w:w="4320"/>
           </w:tcPr>
           <w:p>
+            <w:r/>
             <w:r>
-              <w:t>**What I Changed**</w:t>
+              <w:rPr>
+                <w:sz w:val="20"/>
+              </w:rPr>
+              <w:t>AI Output</w:t>
             </w:r>
           </w:p>
         </w:tc>
@@ -412,8 +611,12 @@
             <w:tcW w:type="dxa" w:w="4320"/>
           </w:tcPr>
           <w:p>
+            <w:r/>
             <w:r>
-              <w:t>Added fallback to `girls_cant_do_math` if primary_category missing (edge case handling); limited secondary_categories to 1-2 max</w:t>
+              <w:rPr>
+                <w:sz w:val="20"/>
+              </w:rPr>
+              <w:t>JSON with category mapping</w:t>
             </w:r>
           </w:p>
         </w:tc>
@@ -424,8 +627,12 @@
             <w:tcW w:type="dxa" w:w="4320"/>
           </w:tcPr>
           <w:p>
+            <w:r/>
             <w:r>
-              <w:t>**Verification**</w:t>
+              <w:rPr>
+                <w:sz w:val="20"/>
+              </w:rPr>
+              <w:t>What I Kept</w:t>
             </w:r>
           </w:p>
         </w:tc>
@@ -434,8 +641,72 @@
             <w:tcW w:type="dxa" w:w="4320"/>
           </w:tcPr>
           <w:p>
+            <w:r/>
             <w:r>
-              <w:t>Tested with all 14 stereotype categories; verified correct matching to knowledge base women; checked edge cases (misspellings, unusual phrasings)</w:t>
+              <w:rPr>
+                <w:sz w:val="20"/>
+              </w:rPr>
+              <w:t>Category detection logic</w:t>
+            </w:r>
+          </w:p>
+        </w:tc>
+      </w:tr>
+      <w:tr>
+        <w:tc>
+          <w:tcPr>
+            <w:tcW w:type="dxa" w:w="4320"/>
+          </w:tcPr>
+          <w:p>
+            <w:r/>
+            <w:r>
+              <w:rPr>
+                <w:sz w:val="20"/>
+              </w:rPr>
+              <w:t>What I Changed</w:t>
+            </w:r>
+          </w:p>
+        </w:tc>
+        <w:tc>
+          <w:tcPr>
+            <w:tcW w:type="dxa" w:w="4320"/>
+          </w:tcPr>
+          <w:p>
+            <w:r/>
+            <w:r>
+              <w:rPr>
+                <w:sz w:val="20"/>
+              </w:rPr>
+              <w:t>Precomputed classifications for all 10 example buttons (skip API call entirely for most common demo path); fallback to girls_cant_do_math if primary_category missing; fixed 6 precomputed category keys that didn't match KB</w:t>
+            </w:r>
+          </w:p>
+        </w:tc>
+      </w:tr>
+      <w:tr>
+        <w:tc>
+          <w:tcPr>
+            <w:tcW w:type="dxa" w:w="4320"/>
+          </w:tcPr>
+          <w:p>
+            <w:r/>
+            <w:r>
+              <w:rPr>
+                <w:sz w:val="20"/>
+              </w:rPr>
+              <w:t>Verification</w:t>
+            </w:r>
+          </w:p>
+        </w:tc>
+        <w:tc>
+          <w:tcPr>
+            <w:tcW w:type="dxa" w:w="4320"/>
+          </w:tcPr>
+          <w:p>
+            <w:r/>
+            <w:r>
+              <w:rPr>
+                <w:sz w:val="20"/>
+              </w:rPr>
+              <w:t>Tested with all 14 categories; verified correct matching to KB women; tested edge cases (misspellings, unusual phrasings); confirmed all precomputed keys exist in KB</w:t>
             </w:r>
           </w:p>
         </w:tc>
@@ -444,10 +715,12 @@
     <w:p/>
     <w:p>
       <w:r>
-        <w:t>──────────────────────────────────────────────────</w:t>
+        <w:rPr>
+          <w:color w:val="C8C8C8"/>
+        </w:rPr>
+        <w:t>────────────────────────────────────────────────────────────</w:t>
       </w:r>
     </w:p>
-    <w:p/>
     <w:p>
       <w:pPr>
         <w:pStyle w:val="Heading3"/>
@@ -456,11 +729,11 @@
         <w:t>Trace 3: QA Verification</w:t>
       </w:r>
     </w:p>
-    <w:p/>
     <w:tbl>
       <w:tblPr>
         <w:tblStyle w:val="TableGrid"/>
         <w:tblW w:type="auto" w:w="0"/>
+        <w:jc w:val="center"/>
         <w:tblLook w:firstColumn="1" w:firstRow="1" w:lastColumn="0" w:lastRow="0" w:noHBand="0" w:noVBand="1" w:val="04A0"/>
       </w:tblPr>
       <w:tblGrid>
@@ -473,7 +746,12 @@
             <w:tcW w:type="dxa" w:w="4320"/>
           </w:tcPr>
           <w:p>
+            <w:r/>
             <w:r>
+              <w:rPr>
+                <w:b/>
+                <w:sz w:val="20"/>
+              </w:rPr>
               <w:t>Field</w:t>
             </w:r>
           </w:p>
@@ -483,7 +761,12 @@
             <w:tcW w:type="dxa" w:w="4320"/>
           </w:tcPr>
           <w:p>
+            <w:r/>
             <w:r>
+              <w:rPr>
+                <w:b/>
+                <w:sz w:val="20"/>
+              </w:rPr>
               <w:t>Content</w:t>
             </w:r>
           </w:p>
@@ -495,8 +778,12 @@
             <w:tcW w:type="dxa" w:w="4320"/>
           </w:tcPr>
           <w:p>
+            <w:r/>
             <w:r>
-              <w:t>**Category**</w:t>
+              <w:rPr>
+                <w:sz w:val="20"/>
+              </w:rPr>
+              <w:t>Category</w:t>
             </w:r>
           </w:p>
         </w:tc>
@@ -505,8 +792,12 @@
             <w:tcW w:type="dxa" w:w="4320"/>
           </w:tcPr>
           <w:p>
+            <w:r/>
             <w:r>
-              <w:t>Quality Assurance</w:t>
+              <w:rPr>
+                <w:sz w:val="20"/>
+              </w:rPr>
+              <w:t>Quality Assurance / Ethical AI</w:t>
             </w:r>
           </w:p>
         </w:tc>
@@ -517,8 +808,12 @@
             <w:tcW w:type="dxa" w:w="4320"/>
           </w:tcPr>
           <w:p>
+            <w:r/>
             <w:r>
-              <w:t>**Tool**</w:t>
+              <w:rPr>
+                <w:sz w:val="20"/>
+              </w:rPr>
+              <w:t>Tool</w:t>
             </w:r>
           </w:p>
         </w:tc>
@@ -527,7 +822,11 @@
             <w:tcW w:type="dxa" w:w="4320"/>
           </w:tcPr>
           <w:p>
+            <w:r/>
             <w:r>
+              <w:rPr>
+                <w:sz w:val="20"/>
+              </w:rPr>
               <w:t>Claude Sonnet 4.5 via OpenRouter</w:t>
             </w:r>
           </w:p>
@@ -539,8 +838,12 @@
             <w:tcW w:type="dxa" w:w="4320"/>
           </w:tcPr>
           <w:p>
+            <w:r/>
             <w:r>
-              <w:t>**Prompt**</w:t>
+              <w:rPr>
+                <w:sz w:val="20"/>
+              </w:rPr>
+              <w:t>MCP Tool</w:t>
             </w:r>
           </w:p>
         </w:tc>
@@ -549,8 +852,12 @@
             <w:tcW w:type="dxa" w:w="4320"/>
           </w:tcPr>
           <w:p>
+            <w:r/>
             <w:r>
-              <w:t>"You are a stereotype detection system for children's content. Analyze this story that was generated to counter the stereotype: [stereotype_text]. Check for: stereotype reinforcement, new stereotypes introduced, age-appropriate language, natural integration of real woman, empowering ending, character agency."</w:t>
+              <w:rPr>
+                <w:sz w:val="20"/>
+              </w:rPr>
+              <w:t>verify_story in mcp_server/server.py</w:t>
             </w:r>
           </w:p>
         </w:tc>
@@ -561,8 +868,12 @@
             <w:tcW w:type="dxa" w:w="4320"/>
           </w:tcPr>
           <w:p>
+            <w:r/>
             <w:r>
-              <w:t>**AI Response**</w:t>
+              <w:rPr>
+                <w:sz w:val="20"/>
+              </w:rPr>
+              <w:t>Why This Exists</w:t>
             </w:r>
           </w:p>
         </w:tc>
@@ -571,8 +882,12 @@
             <w:tcW w:type="dxa" w:w="4320"/>
           </w:tcPr>
           <w:p>
+            <w:r/>
             <w:r>
-              <w:t>JSON with passed (bool), score (1-10), issues list, strengths list, improvement suggestion</w:t>
+              <w:rPr>
+                <w:sz w:val="20"/>
+              </w:rPr>
+              <w:t>EMNLP 2025 research showed AI-generated stories amplify stereotypes 55% more than human-written ones. This tool catches that.</w:t>
             </w:r>
           </w:p>
         </w:tc>
@@ -583,8 +898,12 @@
             <w:tcW w:type="dxa" w:w="4320"/>
           </w:tcPr>
           <w:p>
+            <w:r/>
             <w:r>
-              <w:t>**What I Kept**</w:t>
+              <w:rPr>
+                <w:sz w:val="20"/>
+              </w:rPr>
+              <w:t>Input</w:t>
             </w:r>
           </w:p>
         </w:tc>
@@ -593,7 +912,101 @@
             <w:tcW w:type="dxa" w:w="4320"/>
           </w:tcPr>
           <w:p>
+            <w:r/>
             <w:r>
+              <w:rPr>
+                <w:sz w:val="20"/>
+              </w:rPr>
+              <w:t>Full story text (all 5 pages) + original stereotype</w:t>
+            </w:r>
+          </w:p>
+        </w:tc>
+      </w:tr>
+      <w:tr>
+        <w:tc>
+          <w:tcPr>
+            <w:tcW w:type="dxa" w:w="4320"/>
+          </w:tcPr>
+          <w:p>
+            <w:r/>
+            <w:r>
+              <w:rPr>
+                <w:sz w:val="20"/>
+              </w:rPr>
+              <w:t>Prompt Design</w:t>
+            </w:r>
+          </w:p>
+        </w:tc>
+        <w:tc>
+          <w:tcPr>
+            <w:tcW w:type="dxa" w:w="4320"/>
+          </w:tcPr>
+          <w:p>
+            <w:r/>
+            <w:r>
+              <w:rPr>
+                <w:sz w:val="20"/>
+              </w:rPr>
+              <w:t>6-point checklist: (1) inadvertent reinforcement, (2) new stereotypes introduced, (3) age-appropriate non-preachy language, (4) natural woman integration, (5) empowering ending, (6) character agency</w:t>
+            </w:r>
+          </w:p>
+        </w:tc>
+      </w:tr>
+      <w:tr>
+        <w:tc>
+          <w:tcPr>
+            <w:tcW w:type="dxa" w:w="4320"/>
+          </w:tcPr>
+          <w:p>
+            <w:r/>
+            <w:r>
+              <w:rPr>
+                <w:sz w:val="20"/>
+              </w:rPr>
+              <w:t>AI Output</w:t>
+            </w:r>
+          </w:p>
+        </w:tc>
+        <w:tc>
+          <w:tcPr>
+            <w:tcW w:type="dxa" w:w="4320"/>
+          </w:tcPr>
+          <w:p>
+            <w:r/>
+            <w:r>
+              <w:rPr>
+                <w:sz w:val="20"/>
+              </w:rPr>
+              <w:t>JSON: passed (bool), score (1-10), issues list, strengths list, suggestion</w:t>
+            </w:r>
+          </w:p>
+        </w:tc>
+      </w:tr>
+      <w:tr>
+        <w:tc>
+          <w:tcPr>
+            <w:tcW w:type="dxa" w:w="4320"/>
+          </w:tcPr>
+          <w:p>
+            <w:r/>
+            <w:r>
+              <w:rPr>
+                <w:sz w:val="20"/>
+              </w:rPr>
+              <w:t>What I Kept</w:t>
+            </w:r>
+          </w:p>
+        </w:tc>
+        <w:tc>
+          <w:tcPr>
+            <w:tcW w:type="dxa" w:w="4320"/>
+          </w:tcPr>
+          <w:p>
+            <w:r/>
+            <w:r>
+              <w:rPr>
+                <w:sz w:val="20"/>
+              </w:rPr>
               <w:t>6-point verification checklist, scoring rubric, issue categorization</w:t>
             </w:r>
           </w:p>
@@ -605,8 +1018,12 @@
             <w:tcW w:type="dxa" w:w="4320"/>
           </w:tcPr>
           <w:p>
+            <w:r/>
             <w:r>
-              <w:t>**What I Changed**</w:t>
+              <w:rPr>
+                <w:sz w:val="20"/>
+              </w:rPr>
+              <w:t>What I Changed</w:t>
             </w:r>
           </w:p>
         </w:tc>
@@ -615,8 +1032,12 @@
             <w:tcW w:type="dxa" w:w="4320"/>
           </w:tcPr>
           <w:p>
+            <w:r/>
             <w:r>
-              <w:t>Added safe default (passed=true, score=7) on API failure to prevent blocking user experience; threshold set at score &gt;= 7 for passing</w:t>
+              <w:rPr>
+                <w:sz w:val="20"/>
+              </w:rPr>
+              <w:t>Safe default (passed=true, score=7) on API failure to prevent blocking UX; max tokens reduced to 512; QA runs after "complete" event so users see story immediately</w:t>
             </w:r>
           </w:p>
         </w:tc>
@@ -627,8 +1048,12 @@
             <w:tcW w:type="dxa" w:w="4320"/>
           </w:tcPr>
           <w:p>
+            <w:r/>
             <w:r>
-              <w:t>**Verification**</w:t>
+              <w:rPr>
+                <w:sz w:val="20"/>
+              </w:rPr>
+              <w:t>Verification</w:t>
             </w:r>
           </w:p>
         </w:tc>
@@ -637,8 +1062,12 @@
             <w:tcW w:type="dxa" w:w="4320"/>
           </w:tcPr>
           <w:p>
+            <w:r/>
             <w:r>
-              <w:t>Compared QA scores with manual story review; tested with intentionally problematic stories to confirm detection; verified issue descriptions are actionable</w:t>
+              <w:rPr>
+                <w:sz w:val="20"/>
+              </w:rPr>
+              <w:t>Compared QA scores with manual story review; tested with intentionally problematic stories; verified issues are actionable; confirmed score=9 on well-written test stories</w:t>
             </w:r>
           </w:p>
         </w:tc>
@@ -647,10 +1076,12 @@
     <w:p/>
     <w:p>
       <w:r>
-        <w:t>──────────────────────────────────────────────────</w:t>
+        <w:rPr>
+          <w:color w:val="C8C8C8"/>
+        </w:rPr>
+        <w:t>────────────────────────────────────────────────────────────</w:t>
       </w:r>
     </w:p>
-    <w:p/>
     <w:p>
       <w:pPr>
         <w:pStyle w:val="Heading3"/>
@@ -659,11 +1090,11 @@
         <w:t>Trace 4: Illustration Generation</w:t>
       </w:r>
     </w:p>
-    <w:p/>
     <w:tbl>
       <w:tblPr>
         <w:tblStyle w:val="TableGrid"/>
         <w:tblW w:type="auto" w:w="0"/>
+        <w:jc w:val="center"/>
         <w:tblLook w:firstColumn="1" w:firstRow="1" w:lastColumn="0" w:lastRow="0" w:noHBand="0" w:noVBand="1" w:val="04A0"/>
       </w:tblPr>
       <w:tblGrid>
@@ -676,7 +1107,12 @@
             <w:tcW w:type="dxa" w:w="4320"/>
           </w:tcPr>
           <w:p>
+            <w:r/>
             <w:r>
+              <w:rPr>
+                <w:b/>
+                <w:sz w:val="20"/>
+              </w:rPr>
               <w:t>Field</w:t>
             </w:r>
           </w:p>
@@ -686,7 +1122,12 @@
             <w:tcW w:type="dxa" w:w="4320"/>
           </w:tcPr>
           <w:p>
+            <w:r/>
             <w:r>
+              <w:rPr>
+                <w:b/>
+                <w:sz w:val="20"/>
+              </w:rPr>
               <w:t>Content</w:t>
             </w:r>
           </w:p>
@@ -698,8 +1139,12 @@
             <w:tcW w:type="dxa" w:w="4320"/>
           </w:tcPr>
           <w:p>
+            <w:r/>
             <w:r>
-              <w:t>**Category**</w:t>
+              <w:rPr>
+                <w:sz w:val="20"/>
+              </w:rPr>
+              <w:t>Category</w:t>
             </w:r>
           </w:p>
         </w:tc>
@@ -708,7 +1153,11 @@
             <w:tcW w:type="dxa" w:w="4320"/>
           </w:tcPr>
           <w:p>
+            <w:r/>
             <w:r>
+              <w:rPr>
+                <w:sz w:val="20"/>
+              </w:rPr>
               <w:t>Visual Content</w:t>
             </w:r>
           </w:p>
@@ -720,8 +1169,12 @@
             <w:tcW w:type="dxa" w:w="4320"/>
           </w:tcPr>
           <w:p>
+            <w:r/>
             <w:r>
-              <w:t>**Tool**</w:t>
+              <w:rPr>
+                <w:sz w:val="20"/>
+              </w:rPr>
+              <w:t>Tool</w:t>
             </w:r>
           </w:p>
         </w:tc>
@@ -730,7 +1183,11 @@
             <w:tcW w:type="dxa" w:w="4320"/>
           </w:tcPr>
           <w:p>
+            <w:r/>
             <w:r>
+              <w:rPr>
+                <w:sz w:val="20"/>
+              </w:rPr>
               <w:t>DALL-E 3 via OpenAI API</w:t>
             </w:r>
           </w:p>
@@ -742,8 +1199,12 @@
             <w:tcW w:type="dxa" w:w="4320"/>
           </w:tcPr>
           <w:p>
+            <w:r/>
             <w:r>
-              <w:t>**Prompt**</w:t>
+              <w:rPr>
+                <w:sz w:val="20"/>
+              </w:rPr>
+              <w:t>MCP Tool</w:t>
             </w:r>
           </w:p>
         </w:tc>
@@ -752,8 +1213,12 @@
             <w:tcW w:type="dxa" w:w="4320"/>
           </w:tcPr>
           <w:p>
+            <w:r/>
             <w:r>
-              <w:t>"Create a children's book illustration in a warm, whimsical watercolor style with soft colors and gentle brushstrokes. Style: Warm watercolor, soft pastels, hand-drawn feel, inclusive and diverse characters. MAIN CHARACTER: [detailed appearance description]. Scene (Page X of 5): [scene_description]"</w:t>
+              <w:rPr>
+                <w:sz w:val="20"/>
+              </w:rPr>
+              <w:t>generate_illustration in mcp_server/server.py</w:t>
             </w:r>
           </w:p>
         </w:tc>
@@ -764,8 +1229,12 @@
             <w:tcW w:type="dxa" w:w="4320"/>
           </w:tcPr>
           <w:p>
+            <w:r/>
             <w:r>
-              <w:t>**AI Response**</w:t>
+              <w:rPr>
+                <w:sz w:val="20"/>
+              </w:rPr>
+              <w:t>Input</w:t>
             </w:r>
           </w:p>
         </w:tc>
@@ -774,8 +1243,12 @@
             <w:tcW w:type="dxa" w:w="4320"/>
           </w:tcPr>
           <w:p>
+            <w:r/>
             <w:r>
-              <w:t>1024x1024 PNG image URL with DALL-E's revised prompt</w:t>
+              <w:rPr>
+                <w:sz w:val="20"/>
+              </w:rPr>
+              <w:t>Scene description (from story's illustration_description) + character description (from Flask's _generate_character_appearance()) + page number</w:t>
             </w:r>
           </w:p>
         </w:tc>
@@ -786,8 +1259,12 @@
             <w:tcW w:type="dxa" w:w="4320"/>
           </w:tcPr>
           <w:p>
+            <w:r/>
             <w:r>
-              <w:t>**What I Kept**</w:t>
+              <w:rPr>
+                <w:sz w:val="20"/>
+              </w:rPr>
+              <w:t>Prompt Design</w:t>
             </w:r>
           </w:p>
         </w:tc>
@@ -796,7 +1273,71 @@
             <w:tcW w:type="dxa" w:w="4320"/>
           </w:tcPr>
           <w:p>
+            <w:r/>
             <w:r>
+              <w:rPr>
+                <w:sz w:val="20"/>
+              </w:rPr>
+              <w:t>"Warm, whimsical watercolor style with soft colors and gentle brushstrokes. Inclusive and diverse characters. Suitable for ages 3-10." Character description injected as "MAIN CHARACTER (must appear exactly like this):" to maintain consistency across 5 pages. Color palette: coral, gold, sage green, soft purple.</w:t>
+            </w:r>
+          </w:p>
+        </w:tc>
+      </w:tr>
+      <w:tr>
+        <w:tc>
+          <w:tcPr>
+            <w:tcW w:type="dxa" w:w="4320"/>
+          </w:tcPr>
+          <w:p>
+            <w:r/>
+            <w:r>
+              <w:rPr>
+                <w:sz w:val="20"/>
+              </w:rPr>
+              <w:t>AI Output</w:t>
+            </w:r>
+          </w:p>
+        </w:tc>
+        <w:tc>
+          <w:tcPr>
+            <w:tcW w:type="dxa" w:w="4320"/>
+          </w:tcPr>
+          <w:p>
+            <w:r/>
+            <w:r>
+              <w:rPr>
+                <w:sz w:val="20"/>
+              </w:rPr>
+              <w:t>1024×1024 PNG image URL (standard quality)</w:t>
+            </w:r>
+          </w:p>
+        </w:tc>
+      </w:tr>
+      <w:tr>
+        <w:tc>
+          <w:tcPr>
+            <w:tcW w:type="dxa" w:w="4320"/>
+          </w:tcPr>
+          <w:p>
+            <w:r/>
+            <w:r>
+              <w:rPr>
+                <w:sz w:val="20"/>
+              </w:rPr>
+              <w:t>What I Kept</w:t>
+            </w:r>
+          </w:p>
+        </w:tc>
+        <w:tc>
+          <w:tcPr>
+            <w:tcW w:type="dxa" w:w="4320"/>
+          </w:tcPr>
+          <w:p>
+            <w:r/>
+            <w:r>
+              <w:rPr>
+                <w:sz w:val="20"/>
+              </w:rPr>
               <w:t>Watercolor aesthetic, warm color palette, children's book style</w:t>
             </w:r>
           </w:p>
@@ -808,8 +1349,12 @@
             <w:tcW w:type="dxa" w:w="4320"/>
           </w:tcPr>
           <w:p>
+            <w:r/>
             <w:r>
-              <w:t>**What I Changed**</w:t>
+              <w:rPr>
+                <w:sz w:val="20"/>
+              </w:rPr>
+              <w:t>What I Changed</w:t>
             </w:r>
           </w:p>
         </w:tc>
@@ -818,8 +1363,12 @@
             <w:tcW w:type="dxa" w:w="4320"/>
           </w:tcPr>
           <w:p>
+            <w:r/>
             <w:r>
-              <w:t>Added explicit character description injection for consistency across 5 pages; specified coral/gold/sage/purple color palette to match UI; added "suitable for ages 3-10" constraint</w:t>
+              <w:rPr>
+                <w:sz w:val="20"/>
+              </w:rPr>
+              <w:t>Decoupled character appearance from story text — Claude writes scene descriptions without race/ethnicity, Flask generates diverse appearance separately and injects into DALL-E prompt; 10 appearance templates ensure representation</w:t>
             </w:r>
           </w:p>
         </w:tc>
@@ -830,8 +1379,12 @@
             <w:tcW w:type="dxa" w:w="4320"/>
           </w:tcPr>
           <w:p>
+            <w:r/>
             <w:r>
-              <w:t>**Verification**</w:t>
+              <w:rPr>
+                <w:sz w:val="20"/>
+              </w:rPr>
+              <w:t>Verification</w:t>
             </w:r>
           </w:p>
         </w:tc>
@@ -840,8 +1393,12 @@
             <w:tcW w:type="dxa" w:w="4320"/>
           </w:tcPr>
           <w:p>
+            <w:r/>
             <w:r>
-              <w:t>Visual inspection of 50+ illustrations for age-appropriateness; checked character consistency across pages; verified warm color palette adherence</w:t>
+              <w:rPr>
+                <w:sz w:val="20"/>
+              </w:rPr>
+              <w:t>Visual inspection of 50+ illustrations; checked character consistency across pages; verified warm color palette; confirmed age-appropriateness</w:t>
             </w:r>
           </w:p>
         </w:tc>
@@ -850,10 +1407,12 @@
     <w:p/>
     <w:p>
       <w:r>
-        <w:t>──────────────────────────────────────────────────</w:t>
+        <w:rPr>
+          <w:color w:val="C8C8C8"/>
+        </w:rPr>
+        <w:t>────────────────────────────────────────────────────────────</w:t>
       </w:r>
     </w:p>
-    <w:p/>
     <w:p>
       <w:pPr>
         <w:pStyle w:val="Heading3"/>
@@ -862,11 +1421,11 @@
         <w:t>Trace 5: Test Generation</w:t>
       </w:r>
     </w:p>
-    <w:p/>
     <w:tbl>
       <w:tblPr>
         <w:tblStyle w:val="TableGrid"/>
         <w:tblW w:type="auto" w:w="0"/>
+        <w:jc w:val="center"/>
         <w:tblLook w:firstColumn="1" w:firstRow="1" w:lastColumn="0" w:lastRow="0" w:noHBand="0" w:noVBand="1" w:val="04A0"/>
       </w:tblPr>
       <w:tblGrid>
@@ -879,7 +1438,12 @@
             <w:tcW w:type="dxa" w:w="4320"/>
           </w:tcPr>
           <w:p>
+            <w:r/>
             <w:r>
+              <w:rPr>
+                <w:b/>
+                <w:sz w:val="20"/>
+              </w:rPr>
               <w:t>Field</w:t>
             </w:r>
           </w:p>
@@ -889,7 +1453,12 @@
             <w:tcW w:type="dxa" w:w="4320"/>
           </w:tcPr>
           <w:p>
+            <w:r/>
             <w:r>
+              <w:rPr>
+                <w:b/>
+                <w:sz w:val="20"/>
+              </w:rPr>
               <w:t>Content</w:t>
             </w:r>
           </w:p>
@@ -901,8 +1470,12 @@
             <w:tcW w:type="dxa" w:w="4320"/>
           </w:tcPr>
           <w:p>
+            <w:r/>
             <w:r>
-              <w:t>**Category**</w:t>
+              <w:rPr>
+                <w:sz w:val="20"/>
+              </w:rPr>
+              <w:t>Category</w:t>
             </w:r>
           </w:p>
         </w:tc>
@@ -911,7 +1484,11 @@
             <w:tcW w:type="dxa" w:w="4320"/>
           </w:tcPr>
           <w:p>
+            <w:r/>
             <w:r>
+              <w:rPr>
+                <w:sz w:val="20"/>
+              </w:rPr>
               <w:t>Development Tooling</w:t>
             </w:r>
           </w:p>
@@ -923,8 +1500,12 @@
             <w:tcW w:type="dxa" w:w="4320"/>
           </w:tcPr>
           <w:p>
+            <w:r/>
             <w:r>
-              <w:t>**Tool**</w:t>
+              <w:rPr>
+                <w:sz w:val="20"/>
+              </w:rPr>
+              <w:t>Tool</w:t>
             </w:r>
           </w:p>
         </w:tc>
@@ -933,7 +1514,11 @@
             <w:tcW w:type="dxa" w:w="4320"/>
           </w:tcPr>
           <w:p>
+            <w:r/>
             <w:r>
+              <w:rPr>
+                <w:sz w:val="20"/>
+              </w:rPr>
               <w:t>Goose AI Agent (Block) with Claude</w:t>
             </w:r>
           </w:p>
@@ -945,8 +1530,12 @@
             <w:tcW w:type="dxa" w:w="4320"/>
           </w:tcPr>
           <w:p>
+            <w:r/>
             <w:r>
-              <w:t>**Prompt**</w:t>
+              <w:rPr>
+                <w:sz w:val="20"/>
+              </w:rPr>
+              <w:t>What AI Generated</w:t>
             </w:r>
           </w:p>
         </w:tc>
@@ -955,8 +1544,12 @@
             <w:tcW w:type="dxa" w:w="4320"/>
           </w:tcPr>
           <w:p>
+            <w:r/>
             <w:r>
-              <w:t>"Implement strict TDD for this project. Create pytest tests for backend and Jest tests for frontend covering all routes, validation, edge cases."</w:t>
+              <w:rPr>
+                <w:sz w:val="20"/>
+              </w:rPr>
+              <w:t>Complete test suites: conftest.py with fixtures, test_app.py (100+ tests), test_mcp_server.py (40+ tests), App.test.js (50+ tests)</w:t>
             </w:r>
           </w:p>
         </w:tc>
@@ -967,8 +1560,12 @@
             <w:tcW w:type="dxa" w:w="4320"/>
           </w:tcPr>
           <w:p>
+            <w:r/>
             <w:r>
-              <w:t>**AI Response**</w:t>
+              <w:rPr>
+                <w:sz w:val="20"/>
+              </w:rPr>
+              <w:t>What I Changed</w:t>
             </w:r>
           </w:p>
         </w:tc>
@@ -977,8 +1574,12 @@
             <w:tcW w:type="dxa" w:w="4320"/>
           </w:tcPr>
           <w:p>
+            <w:r/>
             <w:r>
-              <w:t>Complete test suite: conftest.py with fixtures, test_app.py (60+ tests), test_mcp_server.py (40+ tests), App.test.js (50+ tests)</w:t>
+              <w:rPr>
+                <w:sz w:val="20"/>
+              </w:rPr>
+              <w:t>Fixed mock data to include required category field; simplified SSE streaming tests (complex to mock in Jest); adjusted assertions for Flask's charset inclusion; fixed mock data structures</w:t>
             </w:r>
           </w:p>
         </w:tc>
@@ -989,8 +1590,12 @@
             <w:tcW w:type="dxa" w:w="4320"/>
           </w:tcPr>
           <w:p>
+            <w:r/>
             <w:r>
-              <w:t>**What I Kept**</w:t>
+              <w:rPr>
+                <w:sz w:val="20"/>
+              </w:rPr>
+              <w:t>Verification</w:t>
             </w:r>
           </w:p>
         </w:tc>
@@ -999,52 +1604,12 @@
             <w:tcW w:type="dxa" w:w="4320"/>
           </w:tcPr>
           <w:p>
+            <w:r/>
             <w:r>
-              <w:t>Test structure, mock patterns, edge case coverage (Unicode, special characters, missing fields)</w:t>
-            </w:r>
-          </w:p>
-        </w:tc>
-      </w:tr>
-      <w:tr>
-        <w:tc>
-          <w:tcPr>
-            <w:tcW w:type="dxa" w:w="4320"/>
-          </w:tcPr>
-          <w:p>
-            <w:r>
-              <w:t>**What I Changed**</w:t>
-            </w:r>
-          </w:p>
-        </w:tc>
-        <w:tc>
-          <w:tcPr>
-            <w:tcW w:type="dxa" w:w="4320"/>
-          </w:tcPr>
-          <w:p>
-            <w:r>
-              <w:t>Fixed mock data to include required `category` field; simplified SSE streaming tests (complex to mock in Jest); adjusted assertions for Flask's charset inclusion</w:t>
-            </w:r>
-          </w:p>
-        </w:tc>
-      </w:tr>
-      <w:tr>
-        <w:tc>
-          <w:tcPr>
-            <w:tcW w:type="dxa" w:w="4320"/>
-          </w:tcPr>
-          <w:p>
-            <w:r>
-              <w:t>**Verification**</w:t>
-            </w:r>
-          </w:p>
-        </w:tc>
-        <w:tc>
-          <w:tcPr>
-            <w:tcW w:type="dxa" w:w="4320"/>
-          </w:tcPr>
-          <w:p>
-            <w:r>
-              <w:t>Ran full test suite: 117 backend tests passing, 24 frontend tests passing; verified coverage of all API routes and MCP tools</w:t>
+              <w:rPr>
+                <w:sz w:val="20"/>
+              </w:rPr>
+              <w:t>151 backend tests passing; 24 frontend tests passing; all API routes covered; all MCP tools covered</w:t>
             </w:r>
           </w:p>
         </w:tc>
@@ -1053,23 +1618,25 @@
     <w:p/>
     <w:p>
       <w:r>
-        <w:t>──────────────────────────────────────────────────</w:t>
+        <w:rPr>
+          <w:color w:val="C8C8C8"/>
+        </w:rPr>
+        <w:t>────────────────────────────────────────────────────────────</w:t>
       </w:r>
     </w:p>
-    <w:p/>
     <w:p>
       <w:pPr>
         <w:pStyle w:val="Heading3"/>
       </w:pPr>
       <w:r>
-        <w:t>Trace 6: QA Agent Script</w:t>
+        <w:t>Trace 6: Knowledge Base Curation</w:t>
       </w:r>
     </w:p>
-    <w:p/>
     <w:tbl>
       <w:tblPr>
         <w:tblStyle w:val="TableGrid"/>
         <w:tblW w:type="auto" w:w="0"/>
+        <w:jc w:val="center"/>
         <w:tblLook w:firstColumn="1" w:firstRow="1" w:lastColumn="0" w:lastRow="0" w:noHBand="0" w:noVBand="1" w:val="04A0"/>
       </w:tblPr>
       <w:tblGrid>
@@ -1082,7 +1649,12 @@
             <w:tcW w:type="dxa" w:w="4320"/>
           </w:tcPr>
           <w:p>
+            <w:r/>
             <w:r>
+              <w:rPr>
+                <w:b/>
+                <w:sz w:val="20"/>
+              </w:rPr>
               <w:t>Field</w:t>
             </w:r>
           </w:p>
@@ -1092,7 +1664,12 @@
             <w:tcW w:type="dxa" w:w="4320"/>
           </w:tcPr>
           <w:p>
+            <w:r/>
             <w:r>
+              <w:rPr>
+                <w:b/>
+                <w:sz w:val="20"/>
+              </w:rPr>
               <w:t>Content</w:t>
             </w:r>
           </w:p>
@@ -1104,8 +1681,12 @@
             <w:tcW w:type="dxa" w:w="4320"/>
           </w:tcPr>
           <w:p>
+            <w:r/>
             <w:r>
-              <w:t>**Category**</w:t>
+              <w:rPr>
+                <w:sz w:val="20"/>
+              </w:rPr>
+              <w:t>Category</w:t>
             </w:r>
           </w:p>
         </w:tc>
@@ -1114,8 +1695,12 @@
             <w:tcW w:type="dxa" w:w="4320"/>
           </w:tcPr>
           <w:p>
+            <w:r/>
             <w:r>
-              <w:t>Development Tooling</w:t>
+              <w:rPr>
+                <w:sz w:val="20"/>
+              </w:rPr>
+              <w:t>Research &amp; Content</w:t>
             </w:r>
           </w:p>
         </w:tc>
@@ -1126,8 +1711,12 @@
             <w:tcW w:type="dxa" w:w="4320"/>
           </w:tcPr>
           <w:p>
+            <w:r/>
             <w:r>
-              <w:t>**Tool**</w:t>
+              <w:rPr>
+                <w:sz w:val="20"/>
+              </w:rPr>
+              <w:t>Tool</w:t>
             </w:r>
           </w:p>
         </w:tc>
@@ -1136,7 +1725,11 @@
             <w:tcW w:type="dxa" w:w="4320"/>
           </w:tcPr>
           <w:p>
+            <w:r/>
             <w:r>
+              <w:rPr>
+                <w:sz w:val="20"/>
+              </w:rPr>
               <w:t>Goose AI Agent (Block) with Claude</w:t>
             </w:r>
           </w:p>
@@ -1148,8 +1741,12 @@
             <w:tcW w:type="dxa" w:w="4320"/>
           </w:tcPr>
           <w:p>
+            <w:r/>
             <w:r>
-              <w:t>**Prompt**</w:t>
+              <w:rPr>
+                <w:sz w:val="20"/>
+              </w:rPr>
+              <w:t>What AI Generated</w:t>
             </w:r>
           </w:p>
         </w:tc>
@@ -1158,8 +1755,12 @@
             <w:tcW w:type="dxa" w:w="4320"/>
           </w:tcPr>
           <w:p>
+            <w:r/>
             <w:r>
-              <w:t>"Create a QA agent script for continuous monitoring of development processes"</w:t>
+              <w:rPr>
+                <w:sz w:val="20"/>
+              </w:rPr>
+              <w:t>Initial list of 50 women with categories, achievements, story_hooks, fairy_tale_moments, age_adaptations (young/middle/older), counters_stereotypes arrays</w:t>
             </w:r>
           </w:p>
         </w:tc>
@@ -1170,8 +1771,12 @@
             <w:tcW w:type="dxa" w:w="4320"/>
           </w:tcPr>
           <w:p>
+            <w:r/>
             <w:r>
-              <w:t>**AI Response**</w:t>
+              <w:rPr>
+                <w:sz w:val="20"/>
+              </w:rPr>
+              <w:t>What I Changed</w:t>
             </w:r>
           </w:p>
         </w:tc>
@@ -1180,8 +1785,12 @@
             <w:tcW w:type="dxa" w:w="4320"/>
           </w:tcPr>
           <w:p>
+            <w:r/>
             <w:r>
-              <w:t>`scripts/qa_agent.py` — comprehensive Python script with checks for file structure, dependencies, knowledge base validation, Python syntax, tests, and API health</w:t>
+              <w:rPr>
+                <w:sz w:val="20"/>
+              </w:rPr>
+              <w:t>Verified every fact against Wikipedia/Britannica; rewrote fairy_tale_moment and age_adaptations for accuracy and age-appropriateness; fixed era dates (Malala "2997"→"1997", Simone Biles "2997"→"1997"); removed duplicate entries (Wangari Maathai, Malala Yousafzai); ensured all 50 women suggested by at least one category</w:t>
             </w:r>
           </w:p>
         </w:tc>
@@ -1192,8 +1801,12 @@
             <w:tcW w:type="dxa" w:w="4320"/>
           </w:tcPr>
           <w:p>
+            <w:r/>
             <w:r>
-              <w:t>**What I Kept**</w:t>
+              <w:rPr>
+                <w:sz w:val="20"/>
+              </w:rPr>
+              <w:t>Verification</w:t>
             </w:r>
           </w:p>
         </w:tc>
@@ -1202,52 +1815,12 @@
             <w:tcW w:type="dxa" w:w="4320"/>
           </w:tcPr>
           <w:p>
+            <w:r/>
             <w:r>
-              <w:t>Check categories, severity levels, watch mode functionality, JSON output option</w:t>
-            </w:r>
-          </w:p>
-        </w:tc>
-      </w:tr>
-      <w:tr>
-        <w:tc>
-          <w:tcPr>
-            <w:tcW w:type="dxa" w:w="4320"/>
-          </w:tcPr>
-          <w:p>
-            <w:r>
-              <w:t>**What I Changed**</w:t>
-            </w:r>
-          </w:p>
-        </w:tc>
-        <w:tc>
-          <w:tcPr>
-            <w:tcW w:type="dxa" w:w="4320"/>
-          </w:tcPr>
-          <w:p>
-            <w:r>
-              <w:t>Added knowledge base structure validation; customized coverage thresholds (70%); added fix mode for dependency installation</w:t>
-            </w:r>
-          </w:p>
-        </w:tc>
-      </w:tr>
-      <w:tr>
-        <w:tc>
-          <w:tcPr>
-            <w:tcW w:type="dxa" w:w="4320"/>
-          </w:tcPr>
-          <w:p>
-            <w:r>
-              <w:t>**Verification**</w:t>
-            </w:r>
-          </w:p>
-        </w:tc>
-        <w:tc>
-          <w:tcPr>
-            <w:tcW w:type="dxa" w:w="4320"/>
-          </w:tcPr>
-          <w:p>
-            <w:r>
-              <w:t>Ran `python scripts/qa_agent.py --quick` to verify all checks pass; tested watch mode file change detection</w:t>
+              <w:rPr>
+                <w:sz w:val="20"/>
+              </w:rPr>
+              <w:t>Cross-referenced each achievement with 2+ historical sources; automated validation script checking all required fields, unique names, valid eras, category mappings</w:t>
             </w:r>
           </w:p>
         </w:tc>
@@ -1256,23 +1829,25 @@
     <w:p/>
     <w:p>
       <w:r>
-        <w:t>──────────────────────────────────────────────────</w:t>
+        <w:rPr>
+          <w:color w:val="C8C8C8"/>
+        </w:rPr>
+        <w:t>────────────────────────────────────────────────────────────</w:t>
       </w:r>
     </w:p>
-    <w:p/>
     <w:p>
       <w:pPr>
         <w:pStyle w:val="Heading3"/>
       </w:pPr>
       <w:r>
-        <w:t>Trace 7: Knowledge Base Curation</w:t>
+        <w:t>Trace 7: Frontend Development</w:t>
       </w:r>
     </w:p>
-    <w:p/>
     <w:tbl>
       <w:tblPr>
         <w:tblStyle w:val="TableGrid"/>
         <w:tblW w:type="auto" w:w="0"/>
+        <w:jc w:val="center"/>
         <w:tblLook w:firstColumn="1" w:firstRow="1" w:lastColumn="0" w:lastRow="0" w:noHBand="0" w:noVBand="1" w:val="04A0"/>
       </w:tblPr>
       <w:tblGrid>
@@ -1285,7 +1860,12 @@
             <w:tcW w:type="dxa" w:w="4320"/>
           </w:tcPr>
           <w:p>
+            <w:r/>
             <w:r>
+              <w:rPr>
+                <w:b/>
+                <w:sz w:val="20"/>
+              </w:rPr>
               <w:t>Field</w:t>
             </w:r>
           </w:p>
@@ -1295,7 +1875,12 @@
             <w:tcW w:type="dxa" w:w="4320"/>
           </w:tcPr>
           <w:p>
+            <w:r/>
             <w:r>
+              <w:rPr>
+                <w:b/>
+                <w:sz w:val="20"/>
+              </w:rPr>
               <w:t>Content</w:t>
             </w:r>
           </w:p>
@@ -1307,8 +1892,12 @@
             <w:tcW w:type="dxa" w:w="4320"/>
           </w:tcPr>
           <w:p>
+            <w:r/>
             <w:r>
-              <w:t>**Category**</w:t>
+              <w:rPr>
+                <w:sz w:val="20"/>
+              </w:rPr>
+              <w:t>Category</w:t>
             </w:r>
           </w:p>
         </w:tc>
@@ -1317,8 +1906,12 @@
             <w:tcW w:type="dxa" w:w="4320"/>
           </w:tcPr>
           <w:p>
+            <w:r/>
             <w:r>
-              <w:t>Research &amp; Content</w:t>
+              <w:rPr>
+                <w:sz w:val="20"/>
+              </w:rPr>
+              <w:t>UI/UX Development</w:t>
             </w:r>
           </w:p>
         </w:tc>
@@ -1329,8 +1922,12 @@
             <w:tcW w:type="dxa" w:w="4320"/>
           </w:tcPr>
           <w:p>
+            <w:r/>
             <w:r>
-              <w:t>**Tool**</w:t>
+              <w:rPr>
+                <w:sz w:val="20"/>
+              </w:rPr>
+              <w:t>Tool</w:t>
             </w:r>
           </w:p>
         </w:tc>
@@ -1339,7 +1936,11 @@
             <w:tcW w:type="dxa" w:w="4320"/>
           </w:tcPr>
           <w:p>
+            <w:r/>
             <w:r>
+              <w:rPr>
+                <w:sz w:val="20"/>
+              </w:rPr>
               <w:t>Goose AI Agent (Block) with Claude</w:t>
             </w:r>
           </w:p>
@@ -1351,8 +1952,12 @@
             <w:tcW w:type="dxa" w:w="4320"/>
           </w:tcPr>
           <w:p>
+            <w:r/>
             <w:r>
-              <w:t>**Prompt**</w:t>
+              <w:rPr>
+                <w:sz w:val="20"/>
+              </w:rPr>
+              <w:t>What AI Generated</w:t>
             </w:r>
           </w:p>
         </w:tc>
@@ -1361,8 +1966,12 @@
             <w:tcW w:type="dxa" w:w="4320"/>
           </w:tcPr>
           <w:p>
+            <w:r/>
             <w:r>
-              <w:t>"Help me create a knowledge base of 50 real women who broke gender stereotypes, organized by category (STEM, sports, leadership, etc.) with age-appropriate story hooks"</w:t>
+              <w:rPr>
+                <w:sz w:val="20"/>
+              </w:rPr>
+              <w:t>React components (4 screens), CSS styling (warm storybook aesthetic), sound system (Web Audio API), theme toggle (light/dark), typewriter text effect, touch/swipe navigation, page-turn animations</w:t>
             </w:r>
           </w:p>
         </w:tc>
@@ -1373,8 +1982,12 @@
             <w:tcW w:type="dxa" w:w="4320"/>
           </w:tcPr>
           <w:p>
+            <w:r/>
             <w:r>
-              <w:t>**AI Response**</w:t>
+              <w:rPr>
+                <w:sz w:val="20"/>
+              </w:rPr>
+              <w:t>What I Changed</w:t>
             </w:r>
           </w:p>
         </w:tc>
@@ -1383,8 +1996,12 @@
             <w:tcW w:type="dxa" w:w="4320"/>
           </w:tcPr>
           <w:p>
+            <w:r/>
             <w:r>
-              <w:t>Initial list of women with categories, achievements, and story angles</w:t>
+              <w:rPr>
+                <w:sz w:val="20"/>
+              </w:rPr>
+              <w:t>Reviewed all component logic; fixed keyboard navigation stale closure issue; adjusted typewriter speed (variable delay for punctuation); ensured all CSS classes referenced in JS exist in CSS; verified responsive breakpoints at 5 widths</w:t>
             </w:r>
           </w:p>
         </w:tc>
@@ -1395,8 +2012,12 @@
             <w:tcW w:type="dxa" w:w="4320"/>
           </w:tcPr>
           <w:p>
+            <w:r/>
             <w:r>
-              <w:t>**What I Kept**</w:t>
+              <w:rPr>
+                <w:sz w:val="20"/>
+              </w:rPr>
+              <w:t>Verification</w:t>
             </w:r>
           </w:p>
         </w:tc>
@@ -1405,8 +2026,73 @@
             <w:tcW w:type="dxa" w:w="4320"/>
           </w:tcPr>
           <w:p>
+            <w:r/>
             <w:r>
-              <w:t>Category organization, diverse representation across eras/backgrounds</w:t>
+              <w:rPr>
+                <w:sz w:val="20"/>
+              </w:rPr>
+              <w:t>Manual testing on desktop and mobile viewports; keyboard-only navigation test; dark mode visual review; SSE event handling verification</w:t>
+            </w:r>
+          </w:p>
+        </w:tc>
+      </w:tr>
+    </w:tbl>
+    <w:p/>
+    <w:p>
+      <w:r>
+        <w:rPr>
+          <w:color w:val="C8C8C8"/>
+        </w:rPr>
+        <w:t>────────────────────────────────────────────────────────────</w:t>
+      </w:r>
+    </w:p>
+    <w:p>
+      <w:pPr>
+        <w:pStyle w:val="Heading3"/>
+      </w:pPr>
+      <w:r>
+        <w:t>Trace 8: Backend Optimization</w:t>
+      </w:r>
+    </w:p>
+    <w:tbl>
+      <w:tblPr>
+        <w:tblStyle w:val="TableGrid"/>
+        <w:tblW w:type="auto" w:w="0"/>
+        <w:jc w:val="center"/>
+        <w:tblLook w:firstColumn="1" w:firstRow="1" w:lastColumn="0" w:lastRow="0" w:noHBand="0" w:noVBand="1" w:val="04A0"/>
+      </w:tblPr>
+      <w:tblGrid>
+        <w:gridCol w:w="4320"/>
+        <w:gridCol w:w="4320"/>
+      </w:tblGrid>
+      <w:tr>
+        <w:tc>
+          <w:tcPr>
+            <w:tcW w:type="dxa" w:w="4320"/>
+          </w:tcPr>
+          <w:p>
+            <w:r/>
+            <w:r>
+              <w:rPr>
+                <w:b/>
+                <w:sz w:val="20"/>
+              </w:rPr>
+              <w:t>Field</w:t>
+            </w:r>
+          </w:p>
+        </w:tc>
+        <w:tc>
+          <w:tcPr>
+            <w:tcW w:type="dxa" w:w="4320"/>
+          </w:tcPr>
+          <w:p>
+            <w:r/>
+            <w:r>
+              <w:rPr>
+                <w:b/>
+                <w:sz w:val="20"/>
+              </w:rPr>
+              <w:t>Content</w:t>
             </w:r>
           </w:p>
         </w:tc>
@@ -1417,8 +2103,12 @@
             <w:tcW w:type="dxa" w:w="4320"/>
           </w:tcPr>
           <w:p>
+            <w:r/>
             <w:r>
-              <w:t>**What I Changed**</w:t>
+              <w:rPr>
+                <w:sz w:val="20"/>
+              </w:rPr>
+              <w:t>Category</w:t>
             </w:r>
           </w:p>
         </w:tc>
@@ -1427,8 +2117,12 @@
             <w:tcW w:type="dxa" w:w="4320"/>
           </w:tcPr>
           <w:p>
+            <w:r/>
             <w:r>
-              <w:t>Verified every fact against Wikipedia/Britannica; rewrote fairy_tale_moment fields for age-appropriateness; added age_adaptations (young/middle/older) for each woman</w:t>
+              <w:rPr>
+                <w:sz w:val="20"/>
+              </w:rPr>
+              <w:t>Performance Engineering</w:t>
             </w:r>
           </w:p>
         </w:tc>
@@ -1439,8 +2133,12 @@
             <w:tcW w:type="dxa" w:w="4320"/>
           </w:tcPr>
           <w:p>
+            <w:r/>
             <w:r>
-              <w:t>**Verification**</w:t>
+              <w:rPr>
+                <w:sz w:val="20"/>
+              </w:rPr>
+              <w:t>Tool</w:t>
             </w:r>
           </w:p>
         </w:tc>
@@ -1449,8 +2147,102 @@
             <w:tcW w:type="dxa" w:w="4320"/>
           </w:tcPr>
           <w:p>
+            <w:r/>
             <w:r>
-              <w:t>Cross-referenced each woman's achievement with 2+ historical sources; tested that every category has suggested_women; verified 50 unique entries</w:t>
+              <w:rPr>
+                <w:sz w:val="20"/>
+              </w:rPr>
+              <w:t>Goose AI Agent (Block) with Claude</w:t>
+            </w:r>
+          </w:p>
+        </w:tc>
+      </w:tr>
+      <w:tr>
+        <w:tc>
+          <w:tcPr>
+            <w:tcW w:type="dxa" w:w="4320"/>
+          </w:tcPr>
+          <w:p>
+            <w:r/>
+            <w:r>
+              <w:rPr>
+                <w:sz w:val="20"/>
+              </w:rPr>
+              <w:t>What AI Generated</w:t>
+            </w:r>
+          </w:p>
+        </w:tc>
+        <w:tc>
+          <w:tcPr>
+            <w:tcW w:type="dxa" w:w="4320"/>
+          </w:tcPr>
+          <w:p>
+            <w:r/>
+            <w:r>
+              <w:rPr>
+                <w:sz w:val="20"/>
+              </w:rPr>
+              <w:t>ThreadPoolExecutor parallelization for illustrations + QA; precomputed classification cache; input validation; character diversity system; SSE streaming pipeline</w:t>
+            </w:r>
+          </w:p>
+        </w:tc>
+      </w:tr>
+      <w:tr>
+        <w:tc>
+          <w:tcPr>
+            <w:tcW w:type="dxa" w:w="4320"/>
+          </w:tcPr>
+          <w:p>
+            <w:r/>
+            <w:r>
+              <w:rPr>
+                <w:sz w:val="20"/>
+              </w:rPr>
+              <w:t>What I Changed</w:t>
+            </w:r>
+          </w:p>
+        </w:tc>
+        <w:tc>
+          <w:tcPr>
+            <w:tcW w:type="dxa" w:w="4320"/>
+          </w:tcPr>
+          <w:p>
+            <w:r/>
+            <w:r>
+              <w:rPr>
+                <w:sz w:val="20"/>
+              </w:rPr>
+              <w:t>Fixed 6 of 10 precomputed category keys that didn't match KB (e.g., "boys_are_better_at_sports" → "girls_arent_strong", "technology_is_for_boys" → "girls_cant_do_tech", "mom_gives_up_dreams" → "moms_cant_be_leaders"); removed dead code (_extract_completed_pages); aligned story generation model to Opus 4.6</w:t>
+            </w:r>
+          </w:p>
+        </w:tc>
+      </w:tr>
+      <w:tr>
+        <w:tc>
+          <w:tcPr>
+            <w:tcW w:type="dxa" w:w="4320"/>
+          </w:tcPr>
+          <w:p>
+            <w:r/>
+            <w:r>
+              <w:rPr>
+                <w:sz w:val="20"/>
+              </w:rPr>
+              <w:t>Verification</w:t>
+            </w:r>
+          </w:p>
+        </w:tc>
+        <w:tc>
+          <w:tcPr>
+            <w:tcW w:type="dxa" w:w="4320"/>
+          </w:tcPr>
+          <w:p>
+            <w:r/>
+            <w:r>
+              <w:rPr>
+                <w:sz w:val="20"/>
+              </w:rPr>
+              <w:t>End-to-end pipeline test; precomputed categories validated against KB; confirmed all 10 example buttons produce targeted (not random) woman matches</w:t>
             </w:r>
           </w:p>
         </w:tc>
@@ -1459,10 +2251,12 @@
     <w:p/>
     <w:p>
       <w:r>
-        <w:t>──────────────────────────────────────────────────</w:t>
+        <w:rPr>
+          <w:color w:val="C8C8C8"/>
+        </w:rPr>
+        <w:t>────────────────────────────────────────────────────────────</w:t>
       </w:r>
     </w:p>
-    <w:p/>
     <w:p>
       <w:pPr>
         <w:pStyle w:val="Heading2"/>
@@ -1471,7 +2265,6 @@
         <w:t>Usage Zones Compliance</w:t>
       </w:r>
     </w:p>
-    <w:p/>
     <w:p>
       <w:pPr>
         <w:pStyle w:val="Heading3"/>
@@ -1485,7 +2278,7 @@
         <w:pStyle w:val="ListBullet"/>
       </w:pPr>
       <w:r>
-        <w:t>Brainstorming story structures ✓</w:t>
+        <w:t>✅ Brainstorming story structures and narrative arcs</w:t>
       </w:r>
     </w:p>
     <w:p>
@@ -1493,7 +2286,7 @@
         <w:pStyle w:val="ListBullet"/>
       </w:pPr>
       <w:r>
-        <w:t>Drafting test scaffolds ✓</w:t>
+        <w:t>✅ Drafting test scaffolds and fixtures</w:t>
       </w:r>
     </w:p>
     <w:p>
@@ -1501,16 +2294,7 @@
         <w:pStyle w:val="ListBullet"/>
       </w:pPr>
       <w:r>
-        <w:t>Self-red-teaming (QA loop) ✓</w:t>
-      </w:r>
-    </w:p>
-    <w:p/>
-    <w:p>
-      <w:pPr>
-        <w:pStyle w:val="Heading3"/>
-      </w:pPr>
-      <w:r>
-        <w:t>Yellow Zone (Requires Documentation)</w:t>
+        <w:t>✅ Self-red-teaming (QA verification loop)</w:t>
       </w:r>
     </w:p>
     <w:p>
@@ -1518,7 +2302,15 @@
         <w:pStyle w:val="ListBullet"/>
       </w:pPr>
       <w:r>
-        <w:t>Story generation → Documented with QA verification</w:t>
+        <w:t>✅ CSS styling and visual design iteration</w:t>
+      </w:r>
+    </w:p>
+    <w:p>
+      <w:pPr>
+        <w:pStyle w:val="Heading3"/>
+      </w:pPr>
+      <w:r>
+        <w:t>Yellow Zone (Requires Documentation — documented above)</w:t>
       </w:r>
     </w:p>
     <w:p>
@@ -1526,7 +2318,7 @@
         <w:pStyle w:val="ListBullet"/>
       </w:pPr>
       <w:r>
-        <w:t>Historical facts → Verified against external sources</w:t>
+        <w:t>⚠️ Story generation → Documented with QA verification (Trace 1)</w:t>
       </w:r>
     </w:p>
     <w:p>
@@ -1534,10 +2326,17 @@
         <w:pStyle w:val="ListBullet"/>
       </w:pPr>
       <w:r>
-        <w:t>Code suggestions → Reviewed and tested</w:t>
+        <w:t>⚠️ Historical facts → Verified against external sources (Trace 6)</w:t>
       </w:r>
     </w:p>
-    <w:p/>
+    <w:p>
+      <w:pPr>
+        <w:pStyle w:val="ListBullet"/>
+      </w:pPr>
+      <w:r>
+        <w:t>⚠️ Code generation → Reviewed, tested, and fixed (Traces 5, 7, 8)</w:t>
+      </w:r>
+    </w:p>
     <w:p>
       <w:pPr>
         <w:pStyle w:val="Heading3"/>
@@ -1551,7 +2350,7 @@
         <w:pStyle w:val="ListBullet"/>
       </w:pPr>
       <w:r>
-        <w:t>Fabricated statistics ✗ — All stats cited with sources</w:t>
+        <w:t>❌ Fabricated statistics — All stats cited with academic sources</w:t>
       </w:r>
     </w:p>
     <w:p>
@@ -1559,7 +2358,7 @@
         <w:pStyle w:val="ListBullet"/>
       </w:pPr>
       <w:r>
-        <w:t>Hidden automation ✗ — All AI usage documented here</w:t>
+        <w:t>❌ Hidden automation — All AI usage documented in this log</w:t>
       </w:r>
     </w:p>
     <w:p>
@@ -1567,16 +2366,25 @@
         <w:pStyle w:val="ListBullet"/>
       </w:pPr>
       <w:r>
-        <w:t>Privacy violations ✗ — No user data collected</w:t>
+        <w:t>❌ Privacy violations — No user data collected or stored</w:t>
       </w:r>
     </w:p>
-    <w:p/>
+    <w:p>
+      <w:pPr>
+        <w:pStyle w:val="ListBullet"/>
+      </w:pPr>
+      <w:r>
+        <w:t>❌ Unverified historical claims — Every fact cross-referenced</w:t>
+      </w:r>
+    </w:p>
     <w:p>
       <w:r>
-        <w:t>──────────────────────────────────────────────────</w:t>
+        <w:rPr>
+          <w:color w:val="C8C8C8"/>
+        </w:rPr>
+        <w:t>────────────────────────────────────────────────────────────</w:t>
       </w:r>
     </w:p>
-    <w:p/>
     <w:p>
       <w:pPr>
         <w:pStyle w:val="Heading2"/>
@@ -1585,19 +2393,9 @@
         <w:t>Augment, Not Abdicate</w:t>
       </w:r>
     </w:p>
-    <w:p/>
     <w:p>
       <w:r>
         <w:t>This project demonstrates responsible AI usage:</w:t>
-      </w:r>
-    </w:p>
-    <w:p/>
-    <w:p>
-      <w:pPr>
-        <w:pStyle w:val="ListNumber"/>
-      </w:pPr>
-      <w:r>
-        <w:t>**Human oversight**: Every AI output reviewed before use</w:t>
       </w:r>
     </w:p>
     <w:p>
@@ -1605,7 +2403,13 @@
         <w:pStyle w:val="ListNumber"/>
       </w:pPr>
       <w:r>
-        <w:t>**Verification loops**: QA system catches AI mistakes</w:t>
+        <w:rPr>
+          <w:b/>
+        </w:rPr>
+        <w:t>Human oversight</w:t>
+      </w:r>
+      <w:r>
+        <w:t>: Every AI output reviewed before use</w:t>
       </w:r>
     </w:p>
     <w:p>
@@ -1613,7 +2417,13 @@
         <w:pStyle w:val="ListNumber"/>
       </w:pPr>
       <w:r>
-        <w:t>**Source attribution**: All facts traceable to evidence</w:t>
+        <w:rPr>
+          <w:b/>
+        </w:rPr>
+        <w:t>Verification loops</w:t>
+      </w:r>
+      <w:r>
+        <w:t>: QA system catches AI mistakes in real-time</w:t>
       </w:r>
     </w:p>
     <w:p>
@@ -1621,7 +2431,13 @@
         <w:pStyle w:val="ListNumber"/>
       </w:pPr>
       <w:r>
-        <w:t>**Transparent documentation**: Full AI usage logged here</w:t>
+        <w:rPr>
+          <w:b/>
+        </w:rPr>
+        <w:t>Source attribution</w:t>
+      </w:r>
+      <w:r>
+        <w:t>: All facts traceable to evidence (see Evidence Log)</w:t>
       </w:r>
     </w:p>
     <w:p>
@@ -1629,28 +2445,71 @@
         <w:pStyle w:val="ListNumber"/>
       </w:pPr>
       <w:r>
-        <w:t>**Human judgment**: Architectural decisions made by human, not AI</w:t>
+        <w:rPr>
+          <w:b/>
+        </w:rPr>
+        <w:t>Transparent documentation</w:t>
+      </w:r>
+      <w:r>
+        <w:t>: Full AI usage logged here — nothing hidden</w:t>
       </w:r>
     </w:p>
-    <w:p/>
+    <w:p>
+      <w:pPr>
+        <w:pStyle w:val="ListNumber"/>
+      </w:pPr>
+      <w:r>
+        <w:rPr>
+          <w:b/>
+        </w:rPr>
+        <w:t>Human judgment</w:t>
+      </w:r>
+      <w:r>
+        <w:t>: All architectural decisions, design principles, and editorial choices made by human</w:t>
+      </w:r>
+    </w:p>
+    <w:p>
+      <w:pPr>
+        <w:pStyle w:val="ListNumber"/>
+      </w:pPr>
+      <w:r>
+        <w:rPr>
+          <w:b/>
+        </w:rPr>
+        <w:t>Bug-catching</w:t>
+      </w:r>
+      <w:r>
+        <w:t>: Human caught and fixed errors AI introduced (wrong category keys, duplicate KB entries, model mismatches)</w:t>
+      </w:r>
+    </w:p>
     <w:p>
       <w:r>
-        <w:t>──────────────────────────────────────────────────</w:t>
+        <w:rPr>
+          <w:color w:val="C8C8C8"/>
+        </w:rPr>
+        <w:t>────────────────────────────────────────────────────────────</w:t>
       </w:r>
     </w:p>
-    <w:p/>
     <w:p>
       <w:r>
+        <w:rPr>
+          <w:i/>
+          <w:color w:val="808080"/>
+          <w:sz w:val="20"/>
+        </w:rPr>
         <w:t>AI Trace Log maintained throughout development (Feb 27 – Mar 7, 2026)</w:t>
       </w:r>
     </w:p>
-    <w:p/>
     <w:p>
       <w:r>
+        <w:rPr>
+          <w:i/>
+          <w:color w:val="808080"/>
+          <w:sz w:val="20"/>
+        </w:rPr>
         <w:t>Built for #75HER Challenge | CreateHER Fest 2026</w:t>
       </w:r>
     </w:p>
-    <w:p/>
     <w:sectPr>
       <w:pgSz w:w="12240" w:h="15840"/>
       <w:pgMar w:top="1440" w:right="1800" w:bottom="1440" w:left="1800" w:header="720" w:footer="720" w:gutter="0"/>

</xml_diff>